<commit_message>
Add National Regenerative Agriculture Strategy technical expert role
Add participation as a technical expert in the Ethiopian National
Regenerative Agriculture Strategy (2026-2036) to the CV summary, core
competencies and ISD role, and to the website section.

Co-Authored-By: Claude Opus 5.5 <noreply@anthropic.com>
Claude-Session: https://claude.ai/code/session_012R9N82dnAdbutaeBHBbswL
</commit_message>
<xml_diff>
--- a/cv/Andargachew_Detebo_CV_ATS.docx
+++ b/cv/Andargachew_Detebo_CV_ATS.docx
@@ -59,7 +59,7 @@
         <w:rPr>
           <w:b w:val="0"/>
         </w:rPr>
-        <w:t>Agronomist and project manager with 17 years of experience in agricultural research, extension and rural development in Ethiopia. Manages policy advocacy, consortium coordination and monitoring for the Biovision-funded push-pull project at the Institute for Sustainable Development (ISD). Spent five years coordinating field research, crop production and logistics for the EU-funded UPSCALE push-pull project, and co-authored peer-reviewed studies on push-pull cropping. Organizes farmers into seed producer groups and cooperatives from kebele to regional level and links them to seed and output markets within the Ethiopian seed system. Holds an MSc in Agronomy. Works in R, GenStat, ArcGIS Pro and Microsoft Office.</w:t>
+        <w:t>Agronomist and project manager with 17 years of experience in agricultural research, extension and rural development in Ethiopia. Manages policy advocacy, consortium coordination and monitoring for the Biovision-funded push-pull project at the Institute for Sustainable Development (ISD). Spent five years coordinating field research, crop production and logistics for the EU-funded UPSCALE push-pull project, and co-authored peer-reviewed studies on push-pull cropping. Actively participates as a technical expert in developing Ethiopia’s National Regenerative Agriculture Strategy (2026–2036). Organizes farmers into seed producer groups and cooperatives from kebele to regional level and links them to seed and output markets within the Ethiopian seed system. Holds an MSc in Agronomy. Works in R, GenStat, ArcGIS Pro and Microsoft Office.</w:t>
       </w:r>
     </w:p>
     <w:p>
@@ -82,7 +82,7 @@
         <w:rPr>
           <w:b w:val="0"/>
         </w:rPr>
-        <w:t>Project management | Seed system development | Cooperative establishment and strengthening | Market value chain development | Policy advocacy | Stakeholder engagement | Multi-stakeholder platform facilitation | Budget planning and donor compliance | Monitoring, evaluation and learning (MEL) | Field research and data management | Training design and delivery | Report writing | Conflict resolution | Team leadership</w:t>
+        <w:t>Project management | Regenerative agriculture | Seed system development | Cooperative establishment and strengthening | Market value chain development | Policy advocacy | Stakeholder engagement | Multi-stakeholder platform facilitation | Budget planning and donor compliance | Monitoring, evaluation and learning (MEL) | Field research and data management | Training design and delivery | Report writing | Conflict resolution | Team leadership</w:t>
       </w:r>
     </w:p>
     <w:p>
@@ -250,6 +250,25 @@
           <w:i/>
         </w:rPr>
         <w:t>Institute for Sustainable Development (ISD) | Addis Ababa, Ethiopia | January 2026 - Present</w:t>
+      </w:r>
+    </w:p>
+    <w:p>
+      <w:pPr>
+        <w:spacing w:before="80" w:after="20"/>
+      </w:pPr>
+      <w:r>
+        <w:rPr>
+          <w:b/>
+        </w:rPr>
+        <w:t>National Regenerative Agriculture Strategy</w:t>
+      </w:r>
+    </w:p>
+    <w:p>
+      <w:pPr>
+        <w:pStyle w:val="ListBullet"/>
+      </w:pPr>
+      <w:r>
+        <w:t>Actively participate as a technical expert in developing the Ethiopian National Regenerative Agriculture Strategy (2026–2036), contributing field evidence from push-pull, soil health and seed system work.</w:t>
       </w:r>
     </w:p>
     <w:p>

</xml_diff>